<commit_message>
Finalize public GitHub delivery
</commit_message>
<xml_diff>
--- a/outputs/ResearchFlow-Hub-Project-Report.docx
+++ b/outputs/ResearchFlow-Hub-Project-Report.docx
@@ -408,11 +408,11 @@
             <w:r>
               <w:rPr>
                 <w:rFonts w:ascii="Aptos" w:hAnsi="Aptos"/>
-                <w:b/>
+                <w:b w:val="0"/>
                 <w:color w:val="17223B"/>
                 <w:sz w:val="18"/>
               </w:rPr>
-              <w:t>Not configured</w:t>
+              <w:t>https://github.com/nexliorakibul/researchflow-hub</w:t>
             </w:r>
           </w:p>
         </w:tc>

</xml_diff>

<commit_message>
Complete live deployment documentation
</commit_message>
<xml_diff>
--- a/outputs/ResearchFlow-Hub-Project-Report.docx
+++ b/outputs/ResearchFlow-Hub-Project-Report.docx
@@ -467,11 +467,11 @@
             <w:r>
               <w:rPr>
                 <w:rFonts w:ascii="Aptos" w:hAnsi="Aptos"/>
-                <w:b/>
+                <w:b w:val="0"/>
                 <w:color w:val="17223B"/>
                 <w:sz w:val="18"/>
               </w:rPr>
-              <w:t>Not deployed</w:t>
+              <w:t>https://researchflow-hub.onrender.com</w:t>
             </w:r>
           </w:p>
         </w:tc>
@@ -493,7 +493,7 @@
           <w:color w:val="667085"/>
           <w:sz w:val="17"/>
         </w:rPr>
-        <w:t>VERSION 1  •  25 SEPTEMBER 2026</w:t>
+        <w:t>VERSION 1  •  26 SEPTEMBER 2026</w:t>
       </w:r>
     </w:p>
     <w:p>

</xml_diff>